<commit_message>
Mobile + CV changes
</commit_message>
<xml_diff>
--- a/Ambardar_CV.docx
+++ b/Ambardar_CV.docx
@@ -765,7 +765,7 @@
           <w:sz w:val="20"/>
           <w:szCs w:val="20"/>
         </w:rPr>
-        <w:t xml:space="preserve">•  Teaching Assistant, Microeconomics Theory (ECON 500), M.S. in Policy Economics (MSPE) — Fall 2022</w:t>
+        <w:t>•  Assistant Instructor, Microeconomics Theory (ECON 500), M.S. in Policy Economics (MSPE) — Fall 2022</w:t>
       </w:r>
     </w:p>
     <w:p>
@@ -988,7 +988,7 @@
           <w:szCs w:val="22"/>
         </w:rPr>
         <w:tab/>
-        <w:t>2024, University of Illinois</w:t>
+        <w:t>2025, University of Illinois</w:t>
       </w:r>
     </w:p>
     <w:p>

</xml_diff>